<commit_message>
Removendo arquivos desnecessarios a etualizando existentes
</commit_message>
<xml_diff>
--- a/Software Requirements Specification ABS PWM.docx
+++ b/Software Requirements Specification ABS PWM.docx
@@ -351,134 +351,51 @@
       </w:pPr>
       <w:r>
         <w:rPr>
-          <w:lang w:val="pt-BR"/>
-        </w:rPr>
-        <w:t>Slip=VelocidadeRoda−VelocidadeVeı</w:t>
-      </w:r>
-      <w:r>
-        <w:rPr>
-          <w:rFonts w:ascii="Arial" w:hAnsi="Arial" w:cs="Arial"/>
-          <w:lang w:val="pt-BR"/>
-        </w:rPr>
-        <w:t>ˊ</w:t>
-      </w:r>
-      <w:r>
-        <w:rPr>
-          <w:lang w:val="pt-BR"/>
-        </w:rPr>
-        <w:t>culoVelocidadeVe</w:t>
-      </w:r>
-      <w:r>
-        <w:rPr>
-          <w:rFonts w:ascii="Aptos" w:hAnsi="Aptos" w:cs="Aptos"/>
-          <w:lang w:val="pt-BR"/>
-        </w:rPr>
-        <w:t>ı</w:t>
-      </w:r>
-      <w:r>
-        <w:rPr>
-          <w:rFonts w:ascii="Arial" w:hAnsi="Arial" w:cs="Arial"/>
-          <w:lang w:val="pt-BR"/>
-        </w:rPr>
-        <w:t>ˊ</w:t>
-      </w:r>
-      <w:r>
-        <w:rPr>
-          <w:lang w:val="pt-BR"/>
-        </w:rPr>
-        <w:t>culoSlip = \frac{Velocidade_{Roda} - Velocidade_{Ve</w:t>
-      </w:r>
-      <w:r>
-        <w:rPr>
-          <w:rFonts w:ascii="Aptos" w:hAnsi="Aptos" w:cs="Aptos"/>
-          <w:lang w:val="pt-BR"/>
-        </w:rPr>
-        <w:t>í</w:t>
-      </w:r>
-      <w:r>
-        <w:rPr>
-          <w:lang w:val="pt-BR"/>
-        </w:rPr>
-        <w:t>culo}}{Velocidade_{Ve</w:t>
-      </w:r>
-      <w:r>
-        <w:rPr>
-          <w:rFonts w:ascii="Aptos" w:hAnsi="Aptos" w:cs="Aptos"/>
-          <w:lang w:val="pt-BR"/>
-        </w:rPr>
-        <w:t>í</w:t>
-      </w:r>
-      <w:r>
-        <w:rPr>
-          <w:lang w:val="pt-BR"/>
-        </w:rPr>
-        <w:t>culo}}Slip=VelocidadeVeı</w:t>
-      </w:r>
-      <w:r>
-        <w:rPr>
-          <w:rFonts w:ascii="Arial" w:hAnsi="Arial" w:cs="Arial"/>
-          <w:lang w:val="pt-BR"/>
-        </w:rPr>
-        <w:t>ˊ</w:t>
-      </w:r>
-      <w:r>
-        <w:rPr>
-          <w:lang w:val="pt-BR"/>
-        </w:rPr>
-        <w:t>culo</w:t>
-      </w:r>
-      <w:r>
-        <w:rPr>
-          <w:rFonts w:ascii="Arial" w:hAnsi="Arial" w:cs="Arial"/>
-          <w:lang w:val="pt-BR"/>
-        </w:rPr>
-        <w:t>​</w:t>
-      </w:r>
-      <w:r>
-        <w:rPr>
-          <w:lang w:val="pt-BR"/>
-        </w:rPr>
-        <w:t>VelocidadeRoda</w:t>
-      </w:r>
-      <w:r>
-        <w:rPr>
-          <w:rFonts w:ascii="Arial" w:hAnsi="Arial" w:cs="Arial"/>
-          <w:lang w:val="pt-BR"/>
-        </w:rPr>
-        <w:t>​</w:t>
-      </w:r>
-      <w:r>
-        <w:rPr>
-          <w:lang w:val="pt-BR"/>
-        </w:rPr>
-        <w:t>−VelocidadeVeı</w:t>
-      </w:r>
-      <w:r>
-        <w:rPr>
-          <w:rFonts w:ascii="Arial" w:hAnsi="Arial" w:cs="Arial"/>
-          <w:lang w:val="pt-BR"/>
-        </w:rPr>
-        <w:t>ˊ</w:t>
-      </w:r>
-      <w:r>
-        <w:rPr>
-          <w:lang w:val="pt-BR"/>
-        </w:rPr>
-        <w:t>culo</w:t>
-      </w:r>
-      <w:r>
-        <w:rPr>
-          <w:rFonts w:ascii="Arial" w:hAnsi="Arial" w:cs="Arial"/>
-          <w:lang w:val="pt-BR"/>
-        </w:rPr>
-        <w:t>​​</w:t>
-      </w:r>
-      <w:r>
-        <w:rPr>
-          <w:lang w:val="pt-BR"/>
-        </w:rPr>
-        <w:t xml:space="preserve"> </w:t>
-      </w:r>
+          <w:noProof/>
+        </w:rPr>
+        <w:drawing>
+          <wp:inline distT="0" distB="0" distL="0" distR="0" wp14:anchorId="67FBC4DE" wp14:editId="40BC71CF">
+            <wp:extent cx="3305175" cy="600075"/>
+            <wp:effectExtent l="0" t="0" r="9525" b="9525"/>
+            <wp:docPr id="1060004707" name="Picture 1"/>
+            <wp:cNvGraphicFramePr>
+              <a:graphicFrameLocks xmlns:a="http://schemas.openxmlformats.org/drawingml/2006/main" noChangeAspect="1"/>
+            </wp:cNvGraphicFramePr>
+            <a:graphic xmlns:a="http://schemas.openxmlformats.org/drawingml/2006/main">
+              <a:graphicData uri="http://schemas.openxmlformats.org/drawingml/2006/picture">
+                <pic:pic xmlns:pic="http://schemas.openxmlformats.org/drawingml/2006/picture">
+                  <pic:nvPicPr>
+                    <pic:cNvPr id="1060004707" name=""/>
+                    <pic:cNvPicPr/>
+                  </pic:nvPicPr>
+                  <pic:blipFill>
+                    <a:blip r:embed="rId5"/>
+                    <a:stretch>
+                      <a:fillRect/>
+                    </a:stretch>
+                  </pic:blipFill>
+                  <pic:spPr>
+                    <a:xfrm>
+                      <a:off x="0" y="0"/>
+                      <a:ext cx="3305175" cy="600075"/>
+                    </a:xfrm>
+                    <a:prstGeom prst="rect">
+                      <a:avLst/>
+                    </a:prstGeom>
+                  </pic:spPr>
+                </pic:pic>
+              </a:graphicData>
+            </a:graphic>
+          </wp:inline>
+        </w:drawing>
+      </w:r>
+    </w:p>
+    <w:p>
+      <w:pPr>
+        <w:rPr>
+          <w:lang w:val="pt-BR"/>
+        </w:rPr>
+      </w:pPr>
     </w:p>
     <w:p>
       <w:pPr>
@@ -2773,11 +2690,11 @@
     <w:name w:val="Normal"/>
     <w:qFormat/>
   </w:style>
-  <w:style w:type="paragraph" w:styleId="Ttulo1">
+  <w:style w:type="paragraph" w:styleId="Heading1">
     <w:name w:val="heading 1"/>
     <w:basedOn w:val="Normal"/>
     <w:next w:val="Normal"/>
-    <w:link w:val="Ttulo1Char"/>
+    <w:link w:val="Heading1Char"/>
     <w:uiPriority w:val="9"/>
     <w:qFormat/>
     <w:rsid w:val="008B0063"/>
@@ -2794,11 +2711,11 @@
       <w:szCs w:val="40"/>
     </w:rPr>
   </w:style>
-  <w:style w:type="paragraph" w:styleId="Ttulo2">
+  <w:style w:type="paragraph" w:styleId="Heading2">
     <w:name w:val="heading 2"/>
     <w:basedOn w:val="Normal"/>
     <w:next w:val="Normal"/>
-    <w:link w:val="Ttulo2Char"/>
+    <w:link w:val="Heading2Char"/>
     <w:uiPriority w:val="9"/>
     <w:semiHidden/>
     <w:unhideWhenUsed/>
@@ -2817,11 +2734,11 @@
       <w:szCs w:val="32"/>
     </w:rPr>
   </w:style>
-  <w:style w:type="paragraph" w:styleId="Ttulo3">
+  <w:style w:type="paragraph" w:styleId="Heading3">
     <w:name w:val="heading 3"/>
     <w:basedOn w:val="Normal"/>
     <w:next w:val="Normal"/>
-    <w:link w:val="Ttulo3Char"/>
+    <w:link w:val="Heading3Char"/>
     <w:uiPriority w:val="9"/>
     <w:semiHidden/>
     <w:unhideWhenUsed/>
@@ -2840,11 +2757,11 @@
       <w:szCs w:val="28"/>
     </w:rPr>
   </w:style>
-  <w:style w:type="paragraph" w:styleId="Ttulo4">
+  <w:style w:type="paragraph" w:styleId="Heading4">
     <w:name w:val="heading 4"/>
     <w:basedOn w:val="Normal"/>
     <w:next w:val="Normal"/>
-    <w:link w:val="Ttulo4Char"/>
+    <w:link w:val="Heading4Char"/>
     <w:uiPriority w:val="9"/>
     <w:semiHidden/>
     <w:unhideWhenUsed/>
@@ -2863,11 +2780,11 @@
       <w:color w:val="0F4761" w:themeColor="accent1" w:themeShade="BF"/>
     </w:rPr>
   </w:style>
-  <w:style w:type="paragraph" w:styleId="Ttulo5">
+  <w:style w:type="paragraph" w:styleId="Heading5">
     <w:name w:val="heading 5"/>
     <w:basedOn w:val="Normal"/>
     <w:next w:val="Normal"/>
-    <w:link w:val="Ttulo5Char"/>
+    <w:link w:val="Heading5Char"/>
     <w:uiPriority w:val="9"/>
     <w:semiHidden/>
     <w:unhideWhenUsed/>
@@ -2884,11 +2801,11 @@
       <w:color w:val="0F4761" w:themeColor="accent1" w:themeShade="BF"/>
     </w:rPr>
   </w:style>
-  <w:style w:type="paragraph" w:styleId="Ttulo6">
+  <w:style w:type="paragraph" w:styleId="Heading6">
     <w:name w:val="heading 6"/>
     <w:basedOn w:val="Normal"/>
     <w:next w:val="Normal"/>
-    <w:link w:val="Ttulo6Char"/>
+    <w:link w:val="Heading6Char"/>
     <w:uiPriority w:val="9"/>
     <w:semiHidden/>
     <w:unhideWhenUsed/>
@@ -2907,11 +2824,11 @@
       <w:color w:val="595959" w:themeColor="text1" w:themeTint="A6"/>
     </w:rPr>
   </w:style>
-  <w:style w:type="paragraph" w:styleId="Ttulo7">
+  <w:style w:type="paragraph" w:styleId="Heading7">
     <w:name w:val="heading 7"/>
     <w:basedOn w:val="Normal"/>
     <w:next w:val="Normal"/>
-    <w:link w:val="Ttulo7Char"/>
+    <w:link w:val="Heading7Char"/>
     <w:uiPriority w:val="9"/>
     <w:semiHidden/>
     <w:unhideWhenUsed/>
@@ -2928,11 +2845,11 @@
       <w:color w:val="595959" w:themeColor="text1" w:themeTint="A6"/>
     </w:rPr>
   </w:style>
-  <w:style w:type="paragraph" w:styleId="Ttulo8">
+  <w:style w:type="paragraph" w:styleId="Heading8">
     <w:name w:val="heading 8"/>
     <w:basedOn w:val="Normal"/>
     <w:next w:val="Normal"/>
-    <w:link w:val="Ttulo8Char"/>
+    <w:link w:val="Heading8Char"/>
     <w:uiPriority w:val="9"/>
     <w:semiHidden/>
     <w:unhideWhenUsed/>
@@ -2951,11 +2868,11 @@
       <w:color w:val="272727" w:themeColor="text1" w:themeTint="D8"/>
     </w:rPr>
   </w:style>
-  <w:style w:type="paragraph" w:styleId="Ttulo9">
+  <w:style w:type="paragraph" w:styleId="Heading9">
     <w:name w:val="heading 9"/>
     <w:basedOn w:val="Normal"/>
     <w:next w:val="Normal"/>
-    <w:link w:val="Ttulo9Char"/>
+    <w:link w:val="Heading9Char"/>
     <w:uiPriority w:val="9"/>
     <w:semiHidden/>
     <w:unhideWhenUsed/>
@@ -2972,13 +2889,13 @@
       <w:color w:val="272727" w:themeColor="text1" w:themeTint="D8"/>
     </w:rPr>
   </w:style>
-  <w:style w:type="character" w:default="1" w:styleId="Fontepargpadro">
+  <w:style w:type="character" w:default="1" w:styleId="DefaultParagraphFont">
     <w:name w:val="Default Paragraph Font"/>
     <w:uiPriority w:val="1"/>
     <w:semiHidden/>
     <w:unhideWhenUsed/>
   </w:style>
-  <w:style w:type="table" w:default="1" w:styleId="Tabelanormal">
+  <w:style w:type="table" w:default="1" w:styleId="TableNormal">
     <w:name w:val="Normal Table"/>
     <w:uiPriority w:val="99"/>
     <w:semiHidden/>
@@ -2993,16 +2910,16 @@
       </w:tblCellMar>
     </w:tblPr>
   </w:style>
-  <w:style w:type="numbering" w:default="1" w:styleId="Semlista">
+  <w:style w:type="numbering" w:default="1" w:styleId="NoList">
     <w:name w:val="No List"/>
     <w:uiPriority w:val="99"/>
     <w:semiHidden/>
     <w:unhideWhenUsed/>
   </w:style>
-  <w:style w:type="character" w:customStyle="1" w:styleId="Ttulo1Char">
-    <w:name w:val="Título 1 Char"/>
-    <w:basedOn w:val="Fontepargpadro"/>
-    <w:link w:val="Ttulo1"/>
+  <w:style w:type="character" w:customStyle="1" w:styleId="Heading1Char">
+    <w:name w:val="Heading 1 Char"/>
+    <w:basedOn w:val="DefaultParagraphFont"/>
+    <w:link w:val="Heading1"/>
     <w:uiPriority w:val="9"/>
     <w:rsid w:val="008B0063"/>
     <w:rPr>
@@ -3012,10 +2929,10 @@
       <w:szCs w:val="40"/>
     </w:rPr>
   </w:style>
-  <w:style w:type="character" w:customStyle="1" w:styleId="Ttulo2Char">
-    <w:name w:val="Título 2 Char"/>
-    <w:basedOn w:val="Fontepargpadro"/>
-    <w:link w:val="Ttulo2"/>
+  <w:style w:type="character" w:customStyle="1" w:styleId="Heading2Char">
+    <w:name w:val="Heading 2 Char"/>
+    <w:basedOn w:val="DefaultParagraphFont"/>
+    <w:link w:val="Heading2"/>
     <w:uiPriority w:val="9"/>
     <w:semiHidden/>
     <w:rsid w:val="008B0063"/>
@@ -3026,10 +2943,10 @@
       <w:szCs w:val="32"/>
     </w:rPr>
   </w:style>
-  <w:style w:type="character" w:customStyle="1" w:styleId="Ttulo3Char">
-    <w:name w:val="Título 3 Char"/>
-    <w:basedOn w:val="Fontepargpadro"/>
-    <w:link w:val="Ttulo3"/>
+  <w:style w:type="character" w:customStyle="1" w:styleId="Heading3Char">
+    <w:name w:val="Heading 3 Char"/>
+    <w:basedOn w:val="DefaultParagraphFont"/>
+    <w:link w:val="Heading3"/>
     <w:uiPriority w:val="9"/>
     <w:semiHidden/>
     <w:rsid w:val="008B0063"/>
@@ -3040,10 +2957,10 @@
       <w:szCs w:val="28"/>
     </w:rPr>
   </w:style>
-  <w:style w:type="character" w:customStyle="1" w:styleId="Ttulo4Char">
-    <w:name w:val="Título 4 Char"/>
-    <w:basedOn w:val="Fontepargpadro"/>
-    <w:link w:val="Ttulo4"/>
+  <w:style w:type="character" w:customStyle="1" w:styleId="Heading4Char">
+    <w:name w:val="Heading 4 Char"/>
+    <w:basedOn w:val="DefaultParagraphFont"/>
+    <w:link w:val="Heading4"/>
     <w:uiPriority w:val="9"/>
     <w:semiHidden/>
     <w:rsid w:val="008B0063"/>
@@ -3054,10 +2971,10 @@
       <w:color w:val="0F4761" w:themeColor="accent1" w:themeShade="BF"/>
     </w:rPr>
   </w:style>
-  <w:style w:type="character" w:customStyle="1" w:styleId="Ttulo5Char">
-    <w:name w:val="Título 5 Char"/>
-    <w:basedOn w:val="Fontepargpadro"/>
-    <w:link w:val="Ttulo5"/>
+  <w:style w:type="character" w:customStyle="1" w:styleId="Heading5Char">
+    <w:name w:val="Heading 5 Char"/>
+    <w:basedOn w:val="DefaultParagraphFont"/>
+    <w:link w:val="Heading5"/>
     <w:uiPriority w:val="9"/>
     <w:semiHidden/>
     <w:rsid w:val="008B0063"/>
@@ -3066,10 +2983,10 @@
       <w:color w:val="0F4761" w:themeColor="accent1" w:themeShade="BF"/>
     </w:rPr>
   </w:style>
-  <w:style w:type="character" w:customStyle="1" w:styleId="Ttulo6Char">
-    <w:name w:val="Título 6 Char"/>
-    <w:basedOn w:val="Fontepargpadro"/>
-    <w:link w:val="Ttulo6"/>
+  <w:style w:type="character" w:customStyle="1" w:styleId="Heading6Char">
+    <w:name w:val="Heading 6 Char"/>
+    <w:basedOn w:val="DefaultParagraphFont"/>
+    <w:link w:val="Heading6"/>
     <w:uiPriority w:val="9"/>
     <w:semiHidden/>
     <w:rsid w:val="008B0063"/>
@@ -3080,10 +2997,10 @@
       <w:color w:val="595959" w:themeColor="text1" w:themeTint="A6"/>
     </w:rPr>
   </w:style>
-  <w:style w:type="character" w:customStyle="1" w:styleId="Ttulo7Char">
-    <w:name w:val="Título 7 Char"/>
-    <w:basedOn w:val="Fontepargpadro"/>
-    <w:link w:val="Ttulo7"/>
+  <w:style w:type="character" w:customStyle="1" w:styleId="Heading7Char">
+    <w:name w:val="Heading 7 Char"/>
+    <w:basedOn w:val="DefaultParagraphFont"/>
+    <w:link w:val="Heading7"/>
     <w:uiPriority w:val="9"/>
     <w:semiHidden/>
     <w:rsid w:val="008B0063"/>
@@ -3092,10 +3009,10 @@
       <w:color w:val="595959" w:themeColor="text1" w:themeTint="A6"/>
     </w:rPr>
   </w:style>
-  <w:style w:type="character" w:customStyle="1" w:styleId="Ttulo8Char">
-    <w:name w:val="Título 8 Char"/>
-    <w:basedOn w:val="Fontepargpadro"/>
-    <w:link w:val="Ttulo8"/>
+  <w:style w:type="character" w:customStyle="1" w:styleId="Heading8Char">
+    <w:name w:val="Heading 8 Char"/>
+    <w:basedOn w:val="DefaultParagraphFont"/>
+    <w:link w:val="Heading8"/>
     <w:uiPriority w:val="9"/>
     <w:semiHidden/>
     <w:rsid w:val="008B0063"/>
@@ -3106,10 +3023,10 @@
       <w:color w:val="272727" w:themeColor="text1" w:themeTint="D8"/>
     </w:rPr>
   </w:style>
-  <w:style w:type="character" w:customStyle="1" w:styleId="Ttulo9Char">
-    <w:name w:val="Título 9 Char"/>
-    <w:basedOn w:val="Fontepargpadro"/>
-    <w:link w:val="Ttulo9"/>
+  <w:style w:type="character" w:customStyle="1" w:styleId="Heading9Char">
+    <w:name w:val="Heading 9 Char"/>
+    <w:basedOn w:val="DefaultParagraphFont"/>
+    <w:link w:val="Heading9"/>
     <w:uiPriority w:val="9"/>
     <w:semiHidden/>
     <w:rsid w:val="008B0063"/>
@@ -3118,11 +3035,11 @@
       <w:color w:val="272727" w:themeColor="text1" w:themeTint="D8"/>
     </w:rPr>
   </w:style>
-  <w:style w:type="paragraph" w:styleId="Ttulo">
+  <w:style w:type="paragraph" w:styleId="Title">
     <w:name w:val="Title"/>
     <w:basedOn w:val="Normal"/>
     <w:next w:val="Normal"/>
-    <w:link w:val="TtuloChar"/>
+    <w:link w:val="TitleChar"/>
     <w:uiPriority w:val="10"/>
     <w:qFormat/>
     <w:rsid w:val="008B0063"/>
@@ -3138,10 +3055,10 @@
       <w:szCs w:val="56"/>
     </w:rPr>
   </w:style>
-  <w:style w:type="character" w:customStyle="1" w:styleId="TtuloChar">
-    <w:name w:val="Título Char"/>
-    <w:basedOn w:val="Fontepargpadro"/>
-    <w:link w:val="Ttulo"/>
+  <w:style w:type="character" w:customStyle="1" w:styleId="TitleChar">
+    <w:name w:val="Title Char"/>
+    <w:basedOn w:val="DefaultParagraphFont"/>
+    <w:link w:val="Title"/>
     <w:uiPriority w:val="10"/>
     <w:rsid w:val="008B0063"/>
     <w:rPr>
@@ -3152,11 +3069,11 @@
       <w:szCs w:val="56"/>
     </w:rPr>
   </w:style>
-  <w:style w:type="paragraph" w:styleId="Subttulo">
+  <w:style w:type="paragraph" w:styleId="Subtitle">
     <w:name w:val="Subtitle"/>
     <w:basedOn w:val="Normal"/>
     <w:next w:val="Normal"/>
-    <w:link w:val="SubttuloChar"/>
+    <w:link w:val="SubtitleChar"/>
     <w:uiPriority w:val="11"/>
     <w:qFormat/>
     <w:rsid w:val="008B0063"/>
@@ -3173,10 +3090,10 @@
       <w:szCs w:val="28"/>
     </w:rPr>
   </w:style>
-  <w:style w:type="character" w:customStyle="1" w:styleId="SubttuloChar">
-    <w:name w:val="Subtítulo Char"/>
-    <w:basedOn w:val="Fontepargpadro"/>
-    <w:link w:val="Subttulo"/>
+  <w:style w:type="character" w:customStyle="1" w:styleId="SubtitleChar">
+    <w:name w:val="Subtitle Char"/>
+    <w:basedOn w:val="DefaultParagraphFont"/>
+    <w:link w:val="Subtitle"/>
     <w:uiPriority w:val="11"/>
     <w:rsid w:val="008B0063"/>
     <w:rPr>
@@ -3187,11 +3104,11 @@
       <w:szCs w:val="28"/>
     </w:rPr>
   </w:style>
-  <w:style w:type="paragraph" w:styleId="Citao">
+  <w:style w:type="paragraph" w:styleId="Quote">
     <w:name w:val="Quote"/>
     <w:basedOn w:val="Normal"/>
     <w:next w:val="Normal"/>
-    <w:link w:val="CitaoChar"/>
+    <w:link w:val="QuoteChar"/>
     <w:uiPriority w:val="29"/>
     <w:qFormat/>
     <w:rsid w:val="008B0063"/>
@@ -3205,10 +3122,10 @@
       <w:color w:val="404040" w:themeColor="text1" w:themeTint="BF"/>
     </w:rPr>
   </w:style>
-  <w:style w:type="character" w:customStyle="1" w:styleId="CitaoChar">
-    <w:name w:val="Citação Char"/>
-    <w:basedOn w:val="Fontepargpadro"/>
-    <w:link w:val="Citao"/>
+  <w:style w:type="character" w:customStyle="1" w:styleId="QuoteChar">
+    <w:name w:val="Quote Char"/>
+    <w:basedOn w:val="DefaultParagraphFont"/>
+    <w:link w:val="Quote"/>
     <w:uiPriority w:val="29"/>
     <w:rsid w:val="008B0063"/>
     <w:rPr>
@@ -3217,7 +3134,7 @@
       <w:color w:val="404040" w:themeColor="text1" w:themeTint="BF"/>
     </w:rPr>
   </w:style>
-  <w:style w:type="paragraph" w:styleId="PargrafodaLista">
+  <w:style w:type="paragraph" w:styleId="ListParagraph">
     <w:name w:val="List Paragraph"/>
     <w:basedOn w:val="Normal"/>
     <w:uiPriority w:val="34"/>
@@ -3228,9 +3145,9 @@
       <w:contextualSpacing/>
     </w:pPr>
   </w:style>
-  <w:style w:type="character" w:styleId="nfaseIntensa">
+  <w:style w:type="character" w:styleId="IntenseEmphasis">
     <w:name w:val="Intense Emphasis"/>
-    <w:basedOn w:val="Fontepargpadro"/>
+    <w:basedOn w:val="DefaultParagraphFont"/>
     <w:uiPriority w:val="21"/>
     <w:qFormat/>
     <w:rsid w:val="008B0063"/>
@@ -3240,11 +3157,11 @@
       <w:color w:val="0F4761" w:themeColor="accent1" w:themeShade="BF"/>
     </w:rPr>
   </w:style>
-  <w:style w:type="paragraph" w:styleId="CitaoIntensa">
+  <w:style w:type="paragraph" w:styleId="IntenseQuote">
     <w:name w:val="Intense Quote"/>
     <w:basedOn w:val="Normal"/>
     <w:next w:val="Normal"/>
-    <w:link w:val="CitaoIntensaChar"/>
+    <w:link w:val="IntenseQuoteChar"/>
     <w:uiPriority w:val="30"/>
     <w:qFormat/>
     <w:rsid w:val="008B0063"/>
@@ -3263,10 +3180,10 @@
       <w:color w:val="0F4761" w:themeColor="accent1" w:themeShade="BF"/>
     </w:rPr>
   </w:style>
-  <w:style w:type="character" w:customStyle="1" w:styleId="CitaoIntensaChar">
-    <w:name w:val="Citação Intensa Char"/>
-    <w:basedOn w:val="Fontepargpadro"/>
-    <w:link w:val="CitaoIntensa"/>
+  <w:style w:type="character" w:customStyle="1" w:styleId="IntenseQuoteChar">
+    <w:name w:val="Intense Quote Char"/>
+    <w:basedOn w:val="DefaultParagraphFont"/>
+    <w:link w:val="IntenseQuote"/>
     <w:uiPriority w:val="30"/>
     <w:rsid w:val="008B0063"/>
     <w:rPr>
@@ -3275,9 +3192,9 @@
       <w:color w:val="0F4761" w:themeColor="accent1" w:themeShade="BF"/>
     </w:rPr>
   </w:style>
-  <w:style w:type="character" w:styleId="RefernciaIntensa">
+  <w:style w:type="character" w:styleId="IntenseReference">
     <w:name w:val="Intense Reference"/>
-    <w:basedOn w:val="Fontepargpadro"/>
+    <w:basedOn w:val="DefaultParagraphFont"/>
     <w:uiPriority w:val="32"/>
     <w:qFormat/>
     <w:rsid w:val="008B0063"/>

</xml_diff>